<commit_message>
docs: add website hosting ($10/mo) to recurring costs
Rename the BOM's third group to 'Ongoing (recurring)' and add cloud
hosting alongside the badge rolls, in both the one-pager and its Word
version.

Co-Authored-By: Claude Opus 4.8 <noreply@anthropic.com>
</commit_message>
<xml_diff>
--- a/docs/Synagogue-Name-Tag-Kiosk.docx
+++ b/docs/Synagogue-Name-Tag-Kiosk.docx
@@ -1399,7 +1399,7 @@
                 <w:sz w:val="17"/>
                 <w:szCs w:val="17"/>
               </w:rPr>
-              <w:t xml:space="preserve">ONGOING SUPPLY</w:t>
+              <w:t xml:space="preserve">ONGOING (RECURRING)</w:t>
             </w:r>
           </w:p>
         </w:tc>
@@ -1486,6 +1486,88 @@
           </w:p>
         </w:tc>
       </w:tr>
+      <w:tr>
+        <w:tc>
+          <w:tcPr>
+            <w:tcW w:type="dxa" w:w="6000"/>
+            <w:tcBorders>
+              <w:top w:val="none" w:color="auto" w:sz="0"/>
+              <w:left w:val="none" w:color="auto" w:sz="0"/>
+              <w:bottom w:val="none" w:color="auto" w:sz="0"/>
+              <w:right w:val="none" w:color="auto" w:sz="0"/>
+            </w:tcBorders>
+            <w:tcMar>
+              <w:top w:type="dxa" w:w="100"/>
+              <w:left w:type="dxa" w:w="180"/>
+              <w:bottom w:type="dxa" w:w="100"/>
+              <w:right w:type="dxa" w:w="150"/>
+            </w:tcMar>
+          </w:tcPr>
+          <w:p>
+            <w:r>
+              <w:rPr>
+                <w:rFonts w:ascii="Calibri" w:cs="Calibri" w:eastAsia="Calibri" w:hAnsi="Calibri"/>
+                <w:b w:val="false"/>
+                <w:bCs w:val="false"/>
+                <w:i w:val="false"/>
+                <w:iCs w:val="false"/>
+                <w:color w:val="1A2140"/>
+                <w:sz w:val="21"/>
+                <w:szCs w:val="21"/>
+              </w:rPr>
+              <w:t xml:space="preserve">Website hosting</w:t>
+            </w:r>
+            <w:r>
+              <w:rPr>
+                <w:rFonts w:ascii="Calibri" w:cs="Calibri" w:eastAsia="Calibri" w:hAnsi="Calibri"/>
+                <w:b w:val="false"/>
+                <w:bCs w:val="false"/>
+                <w:i w:val="false"/>
+                <w:iCs w:val="false"/>
+                <w:color w:val="586181"/>
+                <w:sz w:val="17"/>
+                <w:szCs w:val="17"/>
+              </w:rPr>
+              <w:t xml:space="preserve">Cloud hosting for the sign-in web app</w:t>
+            </w:r>
+          </w:p>
+        </w:tc>
+        <w:tc>
+          <w:tcPr>
+            <w:tcW w:type="dxa" w:w="1560"/>
+            <w:tcBorders>
+              <w:top w:val="none" w:color="auto" w:sz="0"/>
+              <w:left w:val="none" w:color="auto" w:sz="0"/>
+              <w:bottom w:val="none" w:color="auto" w:sz="0"/>
+              <w:right w:val="none" w:color="auto" w:sz="0"/>
+            </w:tcBorders>
+            <w:tcMar>
+              <w:top w:type="dxa" w:w="100"/>
+              <w:left w:type="dxa" w:w="150"/>
+              <w:bottom w:type="dxa" w:w="100"/>
+              <w:right w:type="dxa" w:w="180"/>
+            </w:tcMar>
+          </w:tcPr>
+          <w:p>
+            <w:pPr>
+              <w:jc w:val="right"/>
+            </w:pPr>
+            <w:r>
+              <w:rPr>
+                <w:rFonts w:ascii="Calibri" w:cs="Calibri" w:eastAsia="Calibri" w:hAnsi="Calibri"/>
+                <w:b/>
+                <w:bCs/>
+                <w:i w:val="false"/>
+                <w:iCs w:val="false"/>
+                <w:color w:val="1A2140"/>
+                <w:sz w:val="21"/>
+                <w:szCs w:val="21"/>
+              </w:rPr>
+              <w:t xml:space="preserve">$10/mo</w:t>
+            </w:r>
+          </w:p>
+        </w:tc>
+      </w:tr>
     </w:tbl>
     <w:p>
       <w:pPr>
@@ -1503,7 +1585,7 @@
           <w:sz w:val="17"/>
           <w:szCs w:val="17"/>
         </w:rPr>
-        <w:t xml:space="preserve">Badges are a low-cost consumable — about $25 per roll of 250. The web app runs on inexpensive cloud services with a modest monthly cost.</w:t>
+        <w:t xml:space="preserve">The only recurring costs: name badges (about $25 per roll of 250) and cloud hosting at roughly $10 a month.</w:t>
       </w:r>
     </w:p>
     <w:p>

</xml_diff>